<commit_message>
Se corrige el informe incluyendo la clase MatrizAdyacencia
</commit_message>
<xml_diff>
--- a/Informe desafio 2.docx
+++ b/Informe desafio 2.docx
@@ -224,10 +224,10 @@
           <w:noProof/>
         </w:rPr>
         <w:drawing>
-          <wp:inline distT="0" distB="0" distL="0" distR="0" wp14:anchorId="603B9277" wp14:editId="6DAAB45F">
-            <wp:extent cx="6217920" cy="7226300"/>
+          <wp:inline distT="0" distB="0" distL="0" distR="0" wp14:anchorId="603B9277" wp14:editId="56DD267E">
+            <wp:extent cx="5583959" cy="7226300"/>
             <wp:effectExtent l="0" t="0" r="0" b="0"/>
-            <wp:docPr id="1" name="diagrama" descr="Diagrama de clases de Ude@Book" title="Diagrama de clases"/>
+            <wp:docPr id="1" name="diagrama"/>
             <wp:cNvGraphicFramePr>
               <a:graphicFrameLocks xmlns:a="http://schemas.openxmlformats.org/drawingml/2006/main" noChangeAspect="1"/>
             </wp:cNvGraphicFramePr>
@@ -235,14 +235,19 @@
               <a:graphicData uri="http://schemas.openxmlformats.org/drawingml/2006/picture">
                 <pic:pic xmlns:pic="http://schemas.openxmlformats.org/drawingml/2006/picture">
                   <pic:nvPicPr>
-                    <pic:cNvPr id="0" name=""/>
+                    <pic:cNvPr id="1" name="diagrama"/>
                     <pic:cNvPicPr>
                       <a:picLocks noChangeAspect="1" noChangeArrowheads="1"/>
                     </pic:cNvPicPr>
                   </pic:nvPicPr>
                   <pic:blipFill>
-                    <a:blip r:embed="rId7"/>
-                    <a:srcRect/>
+                    <a:blip r:embed="rId7" cstate="print">
+                      <a:extLst>
+                        <a:ext uri="{28A0092B-C50C-407E-A947-70E740481C1C}">
+                          <a14:useLocalDpi xmlns:a14="http://schemas.microsoft.com/office/drawing/2010/main" val="0"/>
+                        </a:ext>
+                      </a:extLst>
+                    </a:blip>
                     <a:stretch>
                       <a:fillRect/>
                     </a:stretch>
@@ -250,7 +255,7 @@
                   <pic:spPr bwMode="auto">
                     <a:xfrm>
                       <a:off x="0" y="0"/>
-                      <a:ext cx="6217920" cy="7226300"/>
+                      <a:ext cx="5583959" cy="7226300"/>
                     </a:xfrm>
                     <a:prstGeom prst="rect">
                       <a:avLst/>
@@ -309,39 +314,36 @@
           <w:sz w:val="24"/>
           <w:szCs w:val="24"/>
         </w:rPr>
-        <w:t xml:space="preserve"> </w:t>
-      </w:r>
-      <w:r>
-        <w:rPr>
-          <w:b/>
-          <w:bCs/>
-          <w:color w:val="3A7C22" w:themeColor="accent6" w:themeShade="BF"/>
-          <w:sz w:val="24"/>
-          <w:szCs w:val="24"/>
-        </w:rPr>
-        <w:t>resumido</w:t>
+        <w:t xml:space="preserve"> resumido</w:t>
       </w:r>
     </w:p>
     <w:p/>
     <w:p>
       <w:pPr>
         <w:rPr>
-          <w:b/>
-          <w:bCs/>
-          <w:color w:val="3A7C22" w:themeColor="accent6" w:themeShade="BF"/>
-          <w:sz w:val="24"/>
-          <w:szCs w:val="24"/>
-        </w:rPr>
-      </w:pPr>
-      <w:r>
-        <w:rPr>
           <w:noProof/>
         </w:rPr>
+      </w:pPr>
+    </w:p>
+    <w:p>
+      <w:pPr>
+        <w:rPr>
+          <w:b/>
+          <w:bCs/>
+          <w:color w:val="3A7C22" w:themeColor="accent6" w:themeShade="BF"/>
+          <w:sz w:val="24"/>
+          <w:szCs w:val="24"/>
+        </w:rPr>
+      </w:pPr>
+      <w:r>
+        <w:rPr>
+          <w:noProof/>
+        </w:rPr>
         <w:drawing>
-          <wp:inline distT="0" distB="0" distL="0" distR="0" wp14:anchorId="13E69CA7" wp14:editId="0D7D3ED5">
+          <wp:inline distT="0" distB="0" distL="0" distR="0" wp14:anchorId="13E69CA7" wp14:editId="46EB95C3">
             <wp:extent cx="6217920" cy="4933950"/>
             <wp:effectExtent l="0" t="0" r="0" b="0"/>
-            <wp:docPr id="511623847" name="Picture 1" descr="The image depicts a UML diagram showcasing a user interface with various components like user, albums, messages, and photos, and a dynamic data structure implementation for lists of users, albums, messages, and photos.&#10;&#10;AI-generated content may be incorrect."/>
+            <wp:docPr id="511623847" name="Picture 1"/>
             <wp:cNvGraphicFramePr>
               <a:graphicFrameLocks xmlns:a="http://schemas.openxmlformats.org/drawingml/2006/main" noChangeAspect="1"/>
             </wp:cNvGraphicFramePr>
@@ -349,7 +351,7 @@
               <a:graphicData uri="http://schemas.openxmlformats.org/drawingml/2006/picture">
                 <pic:pic xmlns:pic="http://schemas.openxmlformats.org/drawingml/2006/picture">
                   <pic:nvPicPr>
-                    <pic:cNvPr id="511623847" name="Picture 1" descr="The image depicts a UML diagram showcasing a user interface with various components like user, albums, messages, and photos, and a dynamic data structure implementation for lists of users, albums, messages, and photos.&#10;&#10;AI-generated content may be incorrect."/>
+                    <pic:cNvPr id="511623847" name="Picture 1"/>
                     <pic:cNvPicPr>
                       <a:picLocks noChangeAspect="1" noChangeArrowheads="1"/>
                     </pic:cNvPicPr>
@@ -362,7 +364,7 @@
                         </a:ext>
                       </a:extLst>
                     </a:blip>
-                    <a:srcRect b="38669"/>
+                    <a:srcRect l="291" t="215" r="-291" b="38469"/>
                     <a:stretch>
                       <a:fillRect/>
                     </a:stretch>

</xml_diff>